<commit_message>
calling it4the low hr PPS
</commit_message>
<xml_diff>
--- a/Michael_Bobak.docx
+++ b/Michael_Bobak.docx
@@ -1,6 +1,6 @@
 
 <file path=word/document.xml><?xml version="1.0" encoding="utf-8"?>
-<w:document xmlns:o="urn:schemas-microsoft-com:office:office" xmlns:r="http://schemas.openxmlformats.org/officeDocument/2006/relationships" xmlns:v="urn:schemas-microsoft-com:vml" xmlns:w="http://schemas.openxmlformats.org/wordprocessingml/2006/main" xmlns:w10="urn:schemas-microsoft-com:office:word" xmlns:wp="http://schemas.openxmlformats.org/drawingml/2006/wordprocessingDrawing" xmlns:wps="http://schemas.microsoft.com/office/word/2010/wordprocessingShape" xmlns:wpg="http://schemas.microsoft.com/office/word/2010/wordprocessingGroup" xmlns:mc="http://schemas.openxmlformats.org/markup-compatibility/2006" xmlns:wp14="http://schemas.microsoft.com/office/word/2010/wordprocessingDrawing" xmlns:w14="http://schemas.microsoft.com/office/word/2010/wordml" xmlns:w15="http://schemas.microsoft.com/office/word/2012/wordml" mc:Ignorable="w14 wp14 w15">
+<w:document xmlns:o="urn:schemas-microsoft-com:office:office" xmlns:r="http://schemas.openxmlformats.org/officeDocument/2006/relationships" xmlns:v="urn:schemas-microsoft-com:vml" xmlns:w="http://schemas.openxmlformats.org/wordprocessingml/2006/main" xmlns:w10="urn:schemas-microsoft-com:office:word" xmlns:wp="http://schemas.openxmlformats.org/drawingml/2006/wordprocessingDrawing" xmlns:pic="http://schemas.openxmlformats.org/drawingml/2006/picture" xmlns:wps="http://schemas.microsoft.com/office/word/2010/wordprocessingShape" xmlns:wpg="http://schemas.microsoft.com/office/word/2010/wordprocessingGroup" xmlns:mc="http://schemas.openxmlformats.org/markup-compatibility/2006" xmlns:wp14="http://schemas.microsoft.com/office/word/2010/wordprocessingDrawing" xmlns:w14="http://schemas.microsoft.com/office/word/2010/wordml" xmlns:w15="http://schemas.microsoft.com/office/word/2012/wordml" mc:Ignorable="w14 wp14 w15">
   <w:body>
     <w:p>
       <w:pPr>
@@ -133,34 +133,7 @@
             <w:sz w:val="20"/>
             <w:szCs w:val="20"/>
           </w:rPr>
-          <w:t>M</w:t>
-        </w:r>
-        <w:r>
-          <w:rPr>
-            <w:rStyle w:val="Hyperlink"/>
-            <w:rFonts w:cs="Arial" w:ascii="Arial" w:hAnsi="Arial"/>
-            <w:sz w:val="20"/>
-            <w:szCs w:val="20"/>
-          </w:rPr>
-          <w:t>B</w:t>
-        </w:r>
-        <w:r>
-          <w:rPr>
-            <w:rStyle w:val="Hyperlink"/>
-            <w:rFonts w:cs="Arial" w:ascii="Arial" w:hAnsi="Arial"/>
-            <w:sz w:val="20"/>
-            <w:szCs w:val="20"/>
-          </w:rPr>
-          <w:t>code.</w:t>
-        </w:r>
-        <w:r>
-          <w:rPr>
-            <w:rStyle w:val="Hyperlink"/>
-            <w:rFonts w:cs="Arial" w:ascii="Arial" w:hAnsi="Arial"/>
-            <w:sz w:val="20"/>
-            <w:szCs w:val="20"/>
-          </w:rPr>
-          <w:t>github.io</w:t>
+          <w:t>MBcode.github.io</w:t>
         </w:r>
       </w:hyperlink>
     </w:p>
@@ -791,7 +764,7 @@
       <w:hyperlink r:id="rId5">
         <w:r>
           <w:rPr>
-            <w:rStyle w:val="ListLabel74"/>
+            <w:rStyle w:val="Style"/>
             <w:rFonts w:cs="Arial" w:ascii="Arial" w:hAnsi="Arial"/>
             <w:b/>
             <w:color w:val="0462C0"/>
@@ -1097,7 +1070,7 @@
       <w:hyperlink r:id="rId6">
         <w:r>
           <w:rPr>
-            <w:rStyle w:val="ListLabel75"/>
+            <w:rStyle w:val="Style"/>
             <w:rFonts w:cs="Arial" w:ascii="Arial" w:hAnsi="Arial"/>
             <w:color w:val="0462C0"/>
             <w:sz w:val="20"/>
@@ -1284,7 +1257,7 @@
       <w:hyperlink r:id="rId7">
         <w:r>
           <w:rPr>
-            <w:rStyle w:val="ListLabel75"/>
+            <w:rStyle w:val="Style"/>
             <w:rFonts w:cs="Arial" w:ascii="Arial" w:hAnsi="Arial"/>
             <w:color w:val="0462C0"/>
             <w:sz w:val="20"/>
@@ -1580,7 +1553,7 @@
       <w:hyperlink r:id="rId8">
         <w:r>
           <w:rPr>
-            <w:rStyle w:val="ListLabel75"/>
+            <w:rStyle w:val="Style"/>
             <w:rFonts w:cs="Arial" w:ascii="Arial" w:hAnsi="Arial"/>
             <w:color w:val="0462C0"/>
             <w:sz w:val="20"/>
@@ -1603,7 +1576,7 @@
       <w:hyperlink r:id="rId9">
         <w:r>
           <w:rPr>
-            <w:rStyle w:val="ListLabel75"/>
+            <w:rStyle w:val="Style"/>
             <w:rFonts w:cs="Arial" w:ascii="Arial" w:hAnsi="Arial"/>
             <w:color w:val="0462C0"/>
             <w:sz w:val="20"/>
@@ -1635,7 +1608,7 @@
       <w:hyperlink r:id="rId10">
         <w:r>
           <w:rPr>
-            <w:rStyle w:val="ListLabel75"/>
+            <w:rStyle w:val="Style"/>
             <w:rFonts w:cs="Arial" w:ascii="Arial" w:hAnsi="Arial"/>
             <w:color w:val="0462C0"/>
             <w:sz w:val="20"/>
@@ -1657,7 +1630,7 @@
       <w:hyperlink r:id="rId11">
         <w:r>
           <w:rPr>
-            <w:rStyle w:val="ListLabel76"/>
+            <w:rStyle w:val="Style"/>
             <w:rFonts w:cs="Arial" w:ascii="Arial" w:hAnsi="Arial"/>
             <w:color w:val="0462C0"/>
             <w:spacing w:val="-2"/>
@@ -1704,7 +1677,7 @@
       <w:hyperlink r:id="rId12">
         <w:r>
           <w:rPr>
-            <w:rStyle w:val="ListLabel75"/>
+            <w:rStyle w:val="Style"/>
             <w:rFonts w:cs="Arial" w:ascii="Arial" w:hAnsi="Arial"/>
             <w:color w:val="0462C0"/>
             <w:sz w:val="20"/>
@@ -1727,7 +1700,7 @@
       <w:hyperlink r:id="rId13">
         <w:r>
           <w:rPr>
-            <w:rStyle w:val="ListLabel76"/>
+            <w:rStyle w:val="Style"/>
             <w:rFonts w:cs="Arial" w:ascii="Arial" w:hAnsi="Arial"/>
             <w:color w:val="0462C0"/>
             <w:spacing w:val="-2"/>
@@ -1769,7 +1742,7 @@
       <w:hyperlink r:id="rId14">
         <w:r>
           <w:rPr>
-            <w:rStyle w:val="ListLabel76"/>
+            <w:rStyle w:val="Style"/>
             <w:rFonts w:cs="Arial" w:ascii="Arial" w:hAnsi="Arial"/>
             <w:color w:val="0462C0"/>
             <w:spacing w:val="-2"/>
@@ -2019,63 +1992,7 @@
           <w:szCs w:val="20"/>
           <w:u w:val="none" w:color="0462C0"/>
         </w:rPr>
-        <w:t xml:space="preserve">Similar to </w:t>
-      </w:r>
-      <w:r>
-        <w:rPr>
-          <w:rStyle w:val="Hyperlink"/>
-          <w:rFonts w:cs="Arial" w:ascii="Arial" w:hAnsi="Arial"/>
-          <w:b w:val="false"/>
-          <w:bCs w:val="false"/>
-          <w:color w:val="000009"/>
-          <w:spacing w:val="-2"/>
-          <w:sz w:val="20"/>
-          <w:szCs w:val="20"/>
-          <w:u w:val="none" w:color="0462C0"/>
-        </w:rPr>
-        <w:t>the vertex</w:t>
-      </w:r>
-      <w:r>
-        <w:rPr>
-          <w:rStyle w:val="Hyperlink"/>
-          <w:rFonts w:cs="Arial" w:ascii="Arial" w:hAnsi="Arial"/>
-          <w:b w:val="false"/>
-          <w:bCs w:val="false"/>
-          <w:color w:val="000009"/>
-          <w:spacing w:val="-2"/>
-          <w:sz w:val="20"/>
-          <w:szCs w:val="20"/>
-          <w:u w:val="none" w:color="0462C0"/>
-        </w:rPr>
-        <w:t xml:space="preserve"> work, but more healthcare </w:t>
-      </w:r>
-      <w:r>
-        <w:rPr>
-          <w:rStyle w:val="Hyperlink"/>
-          <w:rFonts w:cs="Arial" w:ascii="Arial" w:hAnsi="Arial"/>
-          <w:b w:val="false"/>
-          <w:bCs w:val="false"/>
-          <w:color w:val="000009"/>
-          <w:spacing w:val="-2"/>
-          <w:sz w:val="20"/>
-          <w:szCs w:val="20"/>
-          <w:u w:val="none" w:color="0462C0"/>
-        </w:rPr>
-        <w:t xml:space="preserve">focused </w:t>
-      </w:r>
-      <w:r>
-        <w:rPr>
-          <w:rStyle w:val="Hyperlink"/>
-          <w:rFonts w:cs="Arial" w:ascii="Arial" w:hAnsi="Arial"/>
-          <w:b w:val="false"/>
-          <w:bCs w:val="false"/>
-          <w:color w:val="000009"/>
-          <w:spacing w:val="-2"/>
-          <w:sz w:val="20"/>
-          <w:szCs w:val="20"/>
-          <w:u w:val="none" w:color="0462C0"/>
-        </w:rPr>
-        <w:t>and at a larger scale</w:t>
+        <w:t>Similar to the vertex work, but more healthcare focused and at a larger scale</w:t>
       </w:r>
     </w:p>
     <w:p>
@@ -2098,7 +2015,15 @@
         </w:rPr>
       </w:pPr>
       <w:r>
-        <w:rPr/>
+        <w:rPr>
+          <w:rFonts w:cs="Arial" w:ascii="Arial" w:hAnsi="Arial"/>
+          <w:b/>
+          <w:bCs/>
+          <w:color w:val="0462C0"/>
+          <w:spacing w:val="-6"/>
+          <w:sz w:val="20"/>
+          <w:szCs w:val="20"/>
+        </w:rPr>
       </w:r>
     </w:p>
     <w:p>
@@ -2160,21 +2085,7 @@
           <w:szCs w:val="20"/>
           <w:u w:val="none"/>
         </w:rPr>
-        <w:t xml:space="preserve">bjectMatterExpert       </w:t>
-      </w:r>
-      <w:r>
-        <w:rPr>
-          <w:rStyle w:val="Hyperlink"/>
-          <w:rFonts w:cs="Arial" w:ascii="Arial" w:hAnsi="Arial"/>
-          <w:b/>
-          <w:bCs/>
-          <w:color w:val="0462C0"/>
-          <w:spacing w:val="-2"/>
-          <w:sz w:val="20"/>
-          <w:szCs w:val="20"/>
-          <w:u w:val="none"/>
-        </w:rPr>
-        <w:t xml:space="preserve">                                    </w:t>
+        <w:t xml:space="preserve">bjectMatterExpert                                           </w:t>
       </w:r>
       <w:hyperlink r:id="rId16">
         <w:r>
@@ -2227,7 +2138,19 @@
           <w:sz w:val="20"/>
           <w:szCs w:val="20"/>
         </w:rPr>
-        <w:t>2026 – present</w:t>
+        <w:t xml:space="preserve">2026 </w:t>
+      </w:r>
+      <w:r>
+        <w:rPr>
+          <w:rFonts w:cs="Arial" w:ascii="Arial" w:hAnsi="Arial"/>
+          <w:b/>
+          <w:bCs/>
+          <w:color w:val="000009"/>
+          <w:spacing w:val="-2"/>
+          <w:sz w:val="20"/>
+          <w:szCs w:val="20"/>
+        </w:rPr>
+        <w:t>cdjo</w:t>
       </w:r>
     </w:p>
     <w:p>
@@ -2728,7 +2651,7 @@
       <w:hyperlink r:id="rId18">
         <w:r>
           <w:rPr>
-            <w:rStyle w:val="ListLabel75"/>
+            <w:rStyle w:val="Style"/>
             <w:rFonts w:cs="Arial" w:ascii="Arial" w:hAnsi="Arial"/>
             <w:color w:val="0462C0"/>
             <w:sz w:val="20"/>
@@ -3194,7 +3117,7 @@
       <w:hyperlink r:id="rId19">
         <w:r>
           <w:rPr>
-            <w:rStyle w:val="ListLabel81"/>
+            <w:rStyle w:val="Style"/>
             <w:rFonts w:cs="Arial" w:ascii="Arial" w:hAnsi="Arial"/>
             <w:b/>
             <w:bCs/>
@@ -3275,7 +3198,7 @@
       <w:hyperlink r:id="rId20">
         <w:r>
           <w:rPr>
-            <w:rStyle w:val="ListLabel82"/>
+            <w:rStyle w:val="Style"/>
             <w:rFonts w:cs="Arial" w:ascii="Arial" w:hAnsi="Arial"/>
             <w:color w:val="000009"/>
             <w:sz w:val="20"/>
@@ -3467,7 +3390,7 @@
       <w:hyperlink r:id="rId21">
         <w:r>
           <w:rPr>
-            <w:rStyle w:val="ListLabel75"/>
+            <w:rStyle w:val="Style"/>
             <w:rFonts w:cs="Arial" w:ascii="Arial" w:hAnsi="Arial"/>
             <w:color w:val="0462C0"/>
             <w:sz w:val="20"/>
@@ -3556,7 +3479,7 @@
       <w:hyperlink r:id="rId22">
         <w:r>
           <w:rPr>
-            <w:rStyle w:val="ListLabel75"/>
+            <w:rStyle w:val="Style"/>
             <w:rFonts w:cs="Arial" w:ascii="Arial" w:hAnsi="Arial"/>
             <w:color w:val="0462C0"/>
             <w:sz w:val="20"/>
@@ -3567,7 +3490,7 @@
         </w:r>
         <w:r>
           <w:rPr>
-            <w:rStyle w:val="ListLabel75"/>
+            <w:rStyle w:val="Style"/>
             <w:rFonts w:cs="Arial" w:ascii="Arial" w:hAnsi="Arial"/>
             <w:color w:val="0462C0"/>
             <w:spacing w:val="-5"/>
@@ -3579,7 +3502,7 @@
         </w:r>
         <w:r>
           <w:rPr>
-            <w:rStyle w:val="ListLabel75"/>
+            <w:rStyle w:val="Style"/>
             <w:rFonts w:cs="Arial" w:ascii="Arial" w:hAnsi="Arial"/>
             <w:color w:val="0462C0"/>
             <w:sz w:val="20"/>
@@ -3603,7 +3526,7 @@
       <w:hyperlink r:id="rId23">
         <w:r>
           <w:rPr>
-            <w:rStyle w:val="ListLabel75"/>
+            <w:rStyle w:val="Style"/>
             <w:rFonts w:cs="Arial" w:ascii="Arial" w:hAnsi="Arial"/>
             <w:color w:val="0462C0"/>
             <w:sz w:val="20"/>
@@ -3654,7 +3577,7 @@
       <w:hyperlink r:id="rId24">
         <w:r>
           <w:rPr>
-            <w:rStyle w:val="ListLabel84"/>
+            <w:rStyle w:val="Style"/>
             <w:rFonts w:cs="Arial" w:ascii="Arial" w:hAnsi="Arial"/>
             <w:b/>
             <w:bCs/>
@@ -3666,7 +3589,7 @@
         </w:r>
         <w:r>
           <w:rPr>
-            <w:rStyle w:val="ListLabel84"/>
+            <w:rStyle w:val="Style"/>
             <w:rFonts w:cs="Arial" w:ascii="Arial" w:hAnsi="Arial"/>
             <w:b/>
             <w:bCs/>
@@ -3679,7 +3602,7 @@
         </w:r>
         <w:r>
           <w:rPr>
-            <w:rStyle w:val="ListLabel84"/>
+            <w:rStyle w:val="Style"/>
             <w:rFonts w:cs="Arial" w:ascii="Arial" w:hAnsi="Arial"/>
             <w:b/>
             <w:bCs/>
@@ -4142,7 +4065,7 @@
       <w:hyperlink r:id="rId25">
         <w:r>
           <w:rPr>
-            <w:rStyle w:val="ListLabel84"/>
+            <w:rStyle w:val="Style"/>
             <w:rFonts w:cs="Arial" w:ascii="Arial" w:hAnsi="Arial"/>
             <w:b/>
             <w:bCs/>
@@ -4154,7 +4077,7 @@
         </w:r>
         <w:r>
           <w:rPr>
-            <w:rStyle w:val="ListLabel84"/>
+            <w:rStyle w:val="Style"/>
             <w:rFonts w:cs="Arial" w:ascii="Arial" w:hAnsi="Arial"/>
             <w:b/>
             <w:bCs/>
@@ -4167,7 +4090,7 @@
         </w:r>
         <w:r>
           <w:rPr>
-            <w:rStyle w:val="ListLabel84"/>
+            <w:rStyle w:val="Style"/>
             <w:rFonts w:cs="Arial" w:ascii="Arial" w:hAnsi="Arial"/>
             <w:b/>
             <w:bCs/>
@@ -4179,7 +4102,7 @@
         </w:r>
         <w:r>
           <w:rPr>
-            <w:rStyle w:val="ListLabel84"/>
+            <w:rStyle w:val="Style"/>
             <w:rFonts w:cs="Arial" w:ascii="Arial" w:hAnsi="Arial"/>
             <w:b/>
             <w:bCs/>
@@ -4192,7 +4115,7 @@
         </w:r>
         <w:r>
           <w:rPr>
-            <w:rStyle w:val="ListLabel84"/>
+            <w:rStyle w:val="Style"/>
             <w:rFonts w:cs="Arial" w:ascii="Arial" w:hAnsi="Arial"/>
             <w:b/>
             <w:bCs/>
@@ -4741,7 +4664,7 @@
       <w:hyperlink r:id="rId26">
         <w:r>
           <w:rPr>
-            <w:rStyle w:val="ListLabel82"/>
+            <w:rStyle w:val="Style"/>
             <w:rFonts w:cs="Arial" w:ascii="Arial" w:hAnsi="Arial"/>
             <w:color w:val="000009"/>
             <w:sz w:val="20"/>
@@ -4994,7 +4917,7 @@
       <w:hyperlink r:id="rId27">
         <w:r>
           <w:rPr>
-            <w:rStyle w:val="ListLabel87"/>
+            <w:rStyle w:val="Style"/>
             <w:rFonts w:cs="Arial" w:ascii="Arial" w:hAnsi="Arial"/>
             <w:b/>
             <w:sz w:val="20"/>
@@ -5005,7 +4928,7 @@
         </w:r>
         <w:r>
           <w:rPr>
-            <w:rStyle w:val="ListLabel87"/>
+            <w:rStyle w:val="Style"/>
             <w:rFonts w:cs="Arial" w:ascii="Arial" w:hAnsi="Arial"/>
             <w:b/>
             <w:spacing w:val="-13"/>
@@ -5017,7 +4940,7 @@
         </w:r>
         <w:r>
           <w:rPr>
-            <w:rStyle w:val="ListLabel87"/>
+            <w:rStyle w:val="Style"/>
             <w:rFonts w:cs="Arial" w:ascii="Arial" w:hAnsi="Arial"/>
             <w:b/>
             <w:sz w:val="20"/>
@@ -5028,7 +4951,7 @@
         </w:r>
         <w:r>
           <w:rPr>
-            <w:rStyle w:val="ListLabel87"/>
+            <w:rStyle w:val="Style"/>
             <w:rFonts w:cs="Arial" w:ascii="Arial" w:hAnsi="Arial"/>
             <w:b/>
             <w:spacing w:val="-4"/>
@@ -5040,7 +4963,7 @@
         </w:r>
         <w:r>
           <w:rPr>
-            <w:rStyle w:val="ListLabel87"/>
+            <w:rStyle w:val="Style"/>
             <w:rFonts w:cs="Arial" w:ascii="Arial" w:hAnsi="Arial"/>
             <w:b/>
             <w:sz w:val="20"/>
@@ -5051,7 +4974,7 @@
         </w:r>
         <w:r>
           <w:rPr>
-            <w:rStyle w:val="ListLabel87"/>
+            <w:rStyle w:val="Style"/>
             <w:rFonts w:cs="Arial" w:ascii="Arial" w:hAnsi="Arial"/>
             <w:b/>
             <w:spacing w:val="-4"/>
@@ -5063,7 +4986,7 @@
         </w:r>
         <w:r>
           <w:rPr>
-            <w:rStyle w:val="ListLabel87"/>
+            <w:rStyle w:val="Style"/>
             <w:rFonts w:cs="Arial" w:ascii="Arial" w:hAnsi="Arial"/>
             <w:b/>
             <w:sz w:val="20"/>
@@ -5275,7 +5198,7 @@
       <w:hyperlink r:id="rId28">
         <w:r>
           <w:rPr>
-            <w:rStyle w:val="ListLabel90"/>
+            <w:rStyle w:val="Style"/>
             <w:rFonts w:cs="Arial" w:ascii="Arial" w:hAnsi="Arial"/>
             <w:color w:val="0E53CC"/>
             <w:sz w:val="20"/>
@@ -5761,7 +5684,7 @@
       <w:hyperlink r:id="rId29">
         <w:r>
           <w:rPr>
-            <w:rStyle w:val="ListLabel91"/>
+            <w:rStyle w:val="Style"/>
             <w:rFonts w:cs="Arial" w:ascii="Arial" w:hAnsi="Arial"/>
             <w:color w:val="00007E"/>
             <w:sz w:val="20"/>
@@ -5811,7 +5734,7 @@
       <w:hyperlink r:id="rId30">
         <w:r>
           <w:rPr>
-            <w:rStyle w:val="ListLabel90"/>
+            <w:rStyle w:val="Style"/>
             <w:rFonts w:cs="Arial" w:ascii="Arial" w:hAnsi="Arial"/>
             <w:color w:val="0E53CC"/>
             <w:sz w:val="20"/>
@@ -6847,7 +6770,7 @@
       <w:hyperlink r:id="rId39">
         <w:r>
           <w:rPr>
-            <w:rStyle w:val="ListLabel75"/>
+            <w:rStyle w:val="Style"/>
             <w:rFonts w:cs="Arial" w:ascii="Arial" w:hAnsi="Arial"/>
             <w:color w:val="0462C0"/>
             <w:sz w:val="18"/>
@@ -7353,7 +7276,7 @@
       <w:hyperlink r:id="rId40">
         <w:r>
           <w:rPr>
-            <w:rStyle w:val="ListLabel75"/>
+            <w:rStyle w:val="Style"/>
             <w:rFonts w:cs="Arial" w:ascii="Arial" w:hAnsi="Arial"/>
             <w:color w:val="0462C0"/>
             <w:sz w:val="18"/>
@@ -7398,7 +7321,12 @@
         </w:rPr>
       </w:pPr>
       <w:r>
-        <w:rPr/>
+        <w:rPr>
+          <w:rFonts w:cs="Arial" w:ascii="Arial" w:hAnsi="Arial"/>
+          <w:color w:val="000009"/>
+          <w:sz w:val="18"/>
+          <w:szCs w:val="18"/>
+        </w:rPr>
       </w:r>
     </w:p>
     <w:p>
@@ -7948,20 +7876,18 @@
         </w:rPr>
         <w:t xml:space="preserve"> </w:t>
       </w:r>
-      <w:hyperlink r:id="rId42">
-        <w:r>
-          <w:rPr>
-            <w:rStyle w:val="Hyperlink"/>
-            <w:rFonts w:cs="Arial" w:ascii="Arial" w:hAnsi="Arial"/>
-            <w:color w:val="0462C0"/>
-            <w:spacing w:val="-2"/>
-            <w:sz w:val="18"/>
-            <w:szCs w:val="18"/>
-            <w:u w:val="single" w:color="0462C0"/>
-          </w:rPr>
-          <w:t>www.qrg.northwestern.edu/projects/NSF/Cyclepad/aboutcp.htm</w:t>
-        </w:r>
-      </w:hyperlink>
+      <w:r>
+        <w:rPr>
+          <w:rStyle w:val="Hyperlink"/>
+          <w:rFonts w:cs="Arial" w:ascii="Arial" w:hAnsi="Arial"/>
+          <w:color w:val="0462C0"/>
+          <w:spacing w:val="-2"/>
+          <w:sz w:val="18"/>
+          <w:szCs w:val="18"/>
+          <w:u w:val="single" w:color="0462C0"/>
+        </w:rPr>
+        <w:t>www.qrg.northwestern.edu/projects/NSF/Cyclepad/aboutcp.htm</w:t>
+      </w:r>
     </w:p>
     <w:p>
       <w:pPr>
@@ -7978,7 +7904,14 @@
         </w:rPr>
       </w:pPr>
       <w:r>
-        <w:rPr/>
+        <w:rPr>
+          <w:rFonts w:cs="Arial" w:ascii="Arial" w:hAnsi="Arial"/>
+          <w:color w:val="0462C0"/>
+          <w:spacing w:val="-2"/>
+          <w:sz w:val="18"/>
+          <w:szCs w:val="18"/>
+          <w:u w:val="single" w:color="0462C0"/>
+        </w:rPr>
       </w:r>
     </w:p>
     <w:p>
@@ -8034,10 +7967,10 @@
         </w:rPr>
         <w:t xml:space="preserve">Engineer                </w:t>
       </w:r>
-      <w:hyperlink r:id="rId43">
+      <w:hyperlink r:id="rId41">
         <w:r>
           <w:rPr>
-            <w:rStyle w:val="ListLabel94"/>
+            <w:rStyle w:val="Style"/>
             <w:rFonts w:cs="Arial" w:ascii="Arial" w:hAnsi="Arial"/>
             <w:b/>
             <w:bCs/>
@@ -8049,7 +7982,7 @@
         </w:r>
         <w:r>
           <w:rPr>
-            <w:rStyle w:val="ListLabel94"/>
+            <w:rStyle w:val="Style"/>
             <w:rFonts w:cs="Arial" w:ascii="Arial" w:hAnsi="Arial"/>
             <w:b/>
             <w:bCs/>
@@ -8062,7 +7995,7 @@
         </w:r>
         <w:r>
           <w:rPr>
-            <w:rStyle w:val="ListLabel94"/>
+            <w:rStyle w:val="Style"/>
             <w:rFonts w:cs="Arial" w:ascii="Arial" w:hAnsi="Arial"/>
             <w:b/>
             <w:bCs/>
@@ -8074,7 +8007,7 @@
         </w:r>
         <w:r>
           <w:rPr>
-            <w:rStyle w:val="ListLabel94"/>
+            <w:rStyle w:val="Style"/>
             <w:rFonts w:cs="Arial" w:ascii="Arial" w:hAnsi="Arial"/>
             <w:b/>
             <w:bCs/>
@@ -8087,7 +8020,7 @@
         </w:r>
         <w:r>
           <w:rPr>
-            <w:rStyle w:val="ListLabel94"/>
+            <w:rStyle w:val="Style"/>
             <w:rFonts w:cs="Arial" w:ascii="Arial" w:hAnsi="Arial"/>
             <w:b/>
             <w:bCs/>
@@ -8121,10 +8054,10 @@
         </w:rPr>
         <w:t>(</w:t>
       </w:r>
-      <w:hyperlink r:id="rId44">
+      <w:hyperlink r:id="rId42">
         <w:r>
           <w:rPr>
-            <w:rStyle w:val="ListLabel94"/>
+            <w:rStyle w:val="Style"/>
             <w:rFonts w:cs="Arial" w:ascii="Arial" w:hAnsi="Arial"/>
             <w:b/>
             <w:bCs/>
@@ -9317,10 +9250,10 @@
         </w:rPr>
         <w:t xml:space="preserve">a book about innovative distributed object application. See: </w:t>
       </w:r>
-      <w:hyperlink r:id="rId45">
+      <w:hyperlink r:id="rId43">
         <w:r>
           <w:rPr>
-            <w:rStyle w:val="ListLabel75"/>
+            <w:rStyle w:val="Style"/>
             <w:rFonts w:cs="Arial" w:ascii="Arial" w:hAnsi="Arial"/>
             <w:color w:val="0462C0"/>
             <w:sz w:val="18"/>
@@ -9340,10 +9273,10 @@
         </w:rPr>
         <w:t xml:space="preserve"> </w:t>
       </w:r>
-      <w:hyperlink r:id="rId46">
+      <w:hyperlink r:id="rId44">
         <w:r>
           <w:rPr>
-            <w:rStyle w:val="ListLabel75"/>
+            <w:rStyle w:val="Style"/>
             <w:rFonts w:cs="Arial" w:ascii="Arial" w:hAnsi="Arial"/>
             <w:color w:val="0462C0"/>
             <w:sz w:val="18"/>
@@ -9363,10 +9296,10 @@
         </w:rPr>
         <w:t xml:space="preserve"> </w:t>
       </w:r>
-      <w:hyperlink r:id="rId47">
+      <w:hyperlink r:id="rId45">
         <w:r>
           <w:rPr>
-            <w:rStyle w:val="ListLabel75"/>
+            <w:rStyle w:val="Style"/>
             <w:rFonts w:cs="Arial" w:ascii="Arial" w:hAnsi="Arial"/>
             <w:color w:val="0462C0"/>
             <w:sz w:val="18"/>
@@ -9385,10 +9318,10 @@
         </w:rPr>
         <w:t xml:space="preserve"> </w:t>
       </w:r>
-      <w:hyperlink r:id="rId48">
+      <w:hyperlink r:id="rId46">
         <w:r>
           <w:rPr>
-            <w:rStyle w:val="ListLabel75"/>
+            <w:rStyle w:val="Style"/>
             <w:rFonts w:cs="Arial" w:ascii="Arial" w:hAnsi="Arial"/>
             <w:color w:val="0462C0"/>
             <w:sz w:val="18"/>
@@ -9437,9 +9370,9 @@
       </w:r>
     </w:p>
     <w:sectPr>
-      <w:headerReference w:type="even" r:id="rId49"/>
-      <w:headerReference w:type="default" r:id="rId50"/>
-      <w:headerReference w:type="first" r:id="rId51"/>
+      <w:headerReference w:type="even" r:id="rId47"/>
+      <w:headerReference w:type="default" r:id="rId48"/>
+      <w:headerReference w:type="first" r:id="rId49"/>
       <w:type w:val="nextPage"/>
       <w:pgSz w:w="12240" w:h="15840"/>
       <w:pgMar w:left="720" w:right="720" w:gutter="0" w:header="708" w:top="765" w:footer="0" w:bottom="720"/>
@@ -9453,7 +9386,7 @@
 </file>
 
 <file path=word/header1.xml><?xml version="1.0" encoding="utf-8"?>
-<w:hdr xmlns:o="urn:schemas-microsoft-com:office:office" xmlns:r="http://schemas.openxmlformats.org/officeDocument/2006/relationships" xmlns:v="urn:schemas-microsoft-com:vml" xmlns:w="http://schemas.openxmlformats.org/wordprocessingml/2006/main" xmlns:w10="urn:schemas-microsoft-com:office:word" xmlns:wp="http://schemas.openxmlformats.org/drawingml/2006/wordprocessingDrawing" xmlns:wps="http://schemas.microsoft.com/office/word/2010/wordprocessingShape" xmlns:wpg="http://schemas.microsoft.com/office/word/2010/wordprocessingGroup" xmlns:mc="http://schemas.openxmlformats.org/markup-compatibility/2006" xmlns:wp14="http://schemas.microsoft.com/office/word/2010/wordprocessingDrawing" xmlns:w14="http://schemas.microsoft.com/office/word/2010/wordml" xmlns:w15="http://schemas.microsoft.com/office/word/2012/wordml" mc:Ignorable="w14 wp14 w15">
+<w:hdr xmlns:o="urn:schemas-microsoft-com:office:office" xmlns:r="http://schemas.openxmlformats.org/officeDocument/2006/relationships" xmlns:v="urn:schemas-microsoft-com:vml" xmlns:w="http://schemas.openxmlformats.org/wordprocessingml/2006/main" xmlns:w10="urn:schemas-microsoft-com:office:word" xmlns:wp="http://schemas.openxmlformats.org/drawingml/2006/wordprocessingDrawing" xmlns:pic="http://schemas.openxmlformats.org/drawingml/2006/picture" xmlns:wps="http://schemas.microsoft.com/office/word/2010/wordprocessingShape" xmlns:wpg="http://schemas.microsoft.com/office/word/2010/wordprocessingGroup" xmlns:mc="http://schemas.openxmlformats.org/markup-compatibility/2006" xmlns:wp14="http://schemas.microsoft.com/office/word/2010/wordprocessingDrawing" xmlns:w14="http://schemas.microsoft.com/office/word/2010/wordml" xmlns:w15="http://schemas.microsoft.com/office/word/2012/wordml" mc:Ignorable="w14 wp14 w15">
   <w:p>
     <w:pPr>
       <w:pStyle w:val="Header"/>
@@ -9467,7 +9400,7 @@
 </file>
 
 <file path=word/header2.xml><?xml version="1.0" encoding="utf-8"?>
-<w:hdr xmlns:o="urn:schemas-microsoft-com:office:office" xmlns:r="http://schemas.openxmlformats.org/officeDocument/2006/relationships" xmlns:v="urn:schemas-microsoft-com:vml" xmlns:w="http://schemas.openxmlformats.org/wordprocessingml/2006/main" xmlns:w10="urn:schemas-microsoft-com:office:word" xmlns:wp="http://schemas.openxmlformats.org/drawingml/2006/wordprocessingDrawing" xmlns:wps="http://schemas.microsoft.com/office/word/2010/wordprocessingShape" xmlns:wpg="http://schemas.microsoft.com/office/word/2010/wordprocessingGroup" xmlns:mc="http://schemas.openxmlformats.org/markup-compatibility/2006" xmlns:wp14="http://schemas.microsoft.com/office/word/2010/wordprocessingDrawing" xmlns:w14="http://schemas.microsoft.com/office/word/2010/wordml" xmlns:w15="http://schemas.microsoft.com/office/word/2012/wordml" mc:Ignorable="w14 wp14 w15">
+<w:hdr xmlns:o="urn:schemas-microsoft-com:office:office" xmlns:r="http://schemas.openxmlformats.org/officeDocument/2006/relationships" xmlns:v="urn:schemas-microsoft-com:vml" xmlns:w="http://schemas.openxmlformats.org/wordprocessingml/2006/main" xmlns:w10="urn:schemas-microsoft-com:office:word" xmlns:wp="http://schemas.openxmlformats.org/drawingml/2006/wordprocessingDrawing" xmlns:pic="http://schemas.openxmlformats.org/drawingml/2006/picture" xmlns:wps="http://schemas.microsoft.com/office/word/2010/wordprocessingShape" xmlns:wpg="http://schemas.microsoft.com/office/word/2010/wordprocessingGroup" xmlns:mc="http://schemas.openxmlformats.org/markup-compatibility/2006" xmlns:wp14="http://schemas.microsoft.com/office/word/2010/wordprocessingDrawing" xmlns:w14="http://schemas.microsoft.com/office/word/2010/wordml" xmlns:w15="http://schemas.microsoft.com/office/word/2012/wordml" mc:Ignorable="w14 wp14 w15">
   <w:p>
     <w:pPr>
       <w:pStyle w:val="Header"/>
@@ -9481,7 +9414,7 @@
 </file>
 
 <file path=word/header3.xml><?xml version="1.0" encoding="utf-8"?>
-<w:hdr xmlns:o="urn:schemas-microsoft-com:office:office" xmlns:r="http://schemas.openxmlformats.org/officeDocument/2006/relationships" xmlns:v="urn:schemas-microsoft-com:vml" xmlns:w="http://schemas.openxmlformats.org/wordprocessingml/2006/main" xmlns:w10="urn:schemas-microsoft-com:office:word" xmlns:wp="http://schemas.openxmlformats.org/drawingml/2006/wordprocessingDrawing" xmlns:wps="http://schemas.microsoft.com/office/word/2010/wordprocessingShape" xmlns:wpg="http://schemas.microsoft.com/office/word/2010/wordprocessingGroup" xmlns:mc="http://schemas.openxmlformats.org/markup-compatibility/2006" xmlns:wp14="http://schemas.microsoft.com/office/word/2010/wordprocessingDrawing" xmlns:w14="http://schemas.microsoft.com/office/word/2010/wordml" xmlns:w15="http://schemas.microsoft.com/office/word/2012/wordml" mc:Ignorable="w14 wp14 w15">
+<w:hdr xmlns:o="urn:schemas-microsoft-com:office:office" xmlns:r="http://schemas.openxmlformats.org/officeDocument/2006/relationships" xmlns:v="urn:schemas-microsoft-com:vml" xmlns:w="http://schemas.openxmlformats.org/wordprocessingml/2006/main" xmlns:w10="urn:schemas-microsoft-com:office:word" xmlns:wp="http://schemas.openxmlformats.org/drawingml/2006/wordprocessingDrawing" xmlns:pic="http://schemas.openxmlformats.org/drawingml/2006/picture" xmlns:wps="http://schemas.microsoft.com/office/word/2010/wordprocessingShape" xmlns:wpg="http://schemas.microsoft.com/office/word/2010/wordprocessingGroup" xmlns:mc="http://schemas.openxmlformats.org/markup-compatibility/2006" xmlns:wp14="http://schemas.microsoft.com/office/word/2010/wordprocessingDrawing" xmlns:w14="http://schemas.microsoft.com/office/word/2010/wordml" xmlns:w15="http://schemas.microsoft.com/office/word/2012/wordml" mc:Ignorable="w14 wp14 w15">
   <w:p>
     <w:pPr>
       <w:pStyle w:val="Header"/>
@@ -11019,7 +10952,7 @@
     </w:rPr>
   </w:style>
   <w:style w:type="paragraph" w:styleId="Heading1">
-    <w:name w:val="Heading 1"/>
+    <w:name w:val="heading 1"/>
     <w:basedOn w:val="Normal"/>
     <w:next w:val="Normal"/>
     <w:link w:val="Heading1Char"/>
@@ -11040,7 +10973,7 @@
     </w:rPr>
   </w:style>
   <w:style w:type="paragraph" w:styleId="Heading2">
-    <w:name w:val="Heading 2"/>
+    <w:name w:val="heading 2"/>
     <w:basedOn w:val="Normal"/>
     <w:next w:val="Normal"/>
     <w:link w:val="Heading2Char"/>
@@ -11062,7 +10995,7 @@
     </w:rPr>
   </w:style>
   <w:style w:type="paragraph" w:styleId="Heading3">
-    <w:name w:val="Heading 3"/>
+    <w:name w:val="heading 3"/>
     <w:basedOn w:val="Normal"/>
     <w:next w:val="Normal"/>
     <w:link w:val="Heading3Char"/>
@@ -11085,7 +11018,7 @@
     </w:rPr>
   </w:style>
   <w:style w:type="paragraph" w:styleId="Heading4">
-    <w:name w:val="Heading 4"/>
+    <w:name w:val="heading 4"/>
     <w:basedOn w:val="Normal"/>
     <w:next w:val="Normal"/>
     <w:link w:val="Heading4Char"/>
@@ -11108,7 +11041,7 @@
     </w:rPr>
   </w:style>
   <w:style w:type="paragraph" w:styleId="Heading5">
-    <w:name w:val="Heading 5"/>
+    <w:name w:val="heading 5"/>
     <w:basedOn w:val="Normal"/>
     <w:next w:val="Normal"/>
     <w:link w:val="Heading5Char"/>
@@ -11129,7 +11062,7 @@
     </w:rPr>
   </w:style>
   <w:style w:type="paragraph" w:styleId="Heading6">
-    <w:name w:val="Heading 6"/>
+    <w:name w:val="heading 6"/>
     <w:basedOn w:val="Normal"/>
     <w:next w:val="Normal"/>
     <w:link w:val="Heading6Char"/>
@@ -11152,7 +11085,7 @@
     </w:rPr>
   </w:style>
   <w:style w:type="paragraph" w:styleId="Heading7">
-    <w:name w:val="Heading 7"/>
+    <w:name w:val="heading 7"/>
     <w:basedOn w:val="Normal"/>
     <w:next w:val="Normal"/>
     <w:link w:val="Heading7Char"/>
@@ -11173,7 +11106,7 @@
     </w:rPr>
   </w:style>
   <w:style w:type="paragraph" w:styleId="Heading8">
-    <w:name w:val="Heading 8"/>
+    <w:name w:val="heading 8"/>
     <w:basedOn w:val="Normal"/>
     <w:next w:val="Normal"/>
     <w:link w:val="Heading8Char"/>
@@ -11196,7 +11129,7 @@
     </w:rPr>
   </w:style>
   <w:style w:type="paragraph" w:styleId="Heading9">
-    <w:name w:val="Heading 9"/>
+    <w:name w:val="heading 9"/>
     <w:basedOn w:val="Normal"/>
     <w:next w:val="Normal"/>
     <w:link w:val="Heading9Char"/>
@@ -11487,8 +11420,8 @@
       <w14:ligatures w14:val="none"/>
     </w:rPr>
   </w:style>
-  <w:style w:type="character" w:styleId="Bullets">
-    <w:name w:val="Bullets"/>
+  <w:style w:type="character" w:styleId="Bulletsuser">
+    <w:name w:val="Bullets (user)"/>
     <w:qFormat/>
     <w:rPr>
       <w:rFonts w:ascii="OpenSymbol" w:hAnsi="OpenSymbol" w:eastAsia="OpenSymbol" w:cs="OpenSymbol"/>
@@ -11536,7 +11469,7 @@
     </w:rPr>
   </w:style>
   <w:style w:type="paragraph" w:styleId="Caption">
-    <w:name w:val="Caption"/>
+    <w:name w:val="caption"/>
     <w:basedOn w:val="Normal"/>
     <w:qFormat/>
     <w:pPr>
@@ -11685,7 +11618,7 @@
     <w:rPr/>
   </w:style>
   <w:style w:type="paragraph" w:styleId="Header">
-    <w:name w:val="Header"/>
+    <w:name w:val="header"/>
     <w:basedOn w:val="Normal"/>
     <w:link w:val="HeaderChar"/>
     <w:uiPriority w:val="99"/>
@@ -11702,7 +11635,7 @@
     <w:rPr/>
   </w:style>
   <w:style w:type="paragraph" w:styleId="Footer">
-    <w:name w:val="Footer"/>
+    <w:name w:val="footer"/>
     <w:basedOn w:val="Normal"/>
     <w:link w:val="FooterChar"/>
     <w:uiPriority w:val="99"/>
@@ -11767,34 +11700,34 @@
         <a:srgbClr val="000000"/>
       </a:dk1>
       <a:lt1>
-        <a:srgbClr val="ffffff"/>
+        <a:srgbClr val="FFFFFF"/>
       </a:lt1>
       <a:dk2>
-        <a:srgbClr val="1f497d"/>
+        <a:srgbClr val="1F497D"/>
       </a:dk2>
       <a:lt2>
-        <a:srgbClr val="eeece1"/>
+        <a:srgbClr val="EEECE1"/>
       </a:lt2>
       <a:accent1>
-        <a:srgbClr val="4f81bd"/>
+        <a:srgbClr val="4F81BD"/>
       </a:accent1>
       <a:accent2>
-        <a:srgbClr val="c0504d"/>
+        <a:srgbClr val="C0504D"/>
       </a:accent2>
       <a:accent3>
-        <a:srgbClr val="9bbb59"/>
+        <a:srgbClr val="9BBB59"/>
       </a:accent3>
       <a:accent4>
-        <a:srgbClr val="8064a2"/>
+        <a:srgbClr val="8064A2"/>
       </a:accent4>
       <a:accent5>
-        <a:srgbClr val="4bacc6"/>
+        <a:srgbClr val="4BACC6"/>
       </a:accent5>
       <a:accent6>
-        <a:srgbClr val="f79646"/>
+        <a:srgbClr val="F79646"/>
       </a:accent6>
       <a:hlink>
-        <a:srgbClr val="0000ff"/>
+        <a:srgbClr val="0000FF"/>
       </a:hlink>
       <a:folHlink>
         <a:srgbClr val="800080"/>

</xml_diff>